<commit_message>
Clean public copy: remove empty comments part left by the drafting tool (no text changes)
</commit_message>
<xml_diff>
--- a/OCS_book_v1.1.docx
+++ b/OCS_book_v1.1.docx
@@ -14373,10 +14373,6 @@
     </w:sectPr>
   </w:body>
 </w:document>
-</file>
-
-<file path=word/comments.xml><?xml version="1.0" encoding="utf-8"?>
-<w:comments xmlns:w="http://schemas.openxmlformats.org/wordprocessingml/2006/main" xmlns:m="http://schemas.openxmlformats.org/officeDocument/2006/math" xmlns:r="http://schemas.openxmlformats.org/officeDocument/2006/relationships" xmlns:o="urn:schemas-microsoft-com:office:office" xmlns:v="urn:schemas-microsoft-com:vml" xmlns:w10="urn:schemas-microsoft-com:office:word" xmlns:a="http://schemas.openxmlformats.org/drawingml/2006/main" xmlns:pic="http://schemas.openxmlformats.org/drawingml/2006/picture" xmlns:wp="http://schemas.openxmlformats.org/drawingml/2006/wordprocessingDrawing"/>
 </file>
 
 <file path=word/footnotes.xml><?xml version="1.0" encoding="utf-8"?>

</xml_diff>